<commit_message>
Ajout IsValid()) et EnsureValid();
</commit_message>
<xml_diff>
--- a/Documents/Commits-Eddy.docx
+++ b/Documents/Commits-Eddy.docx
@@ -4,20 +4,71 @@
   <w:body>
     <w:p>
       <w:r>
+        <w:drawing>
+          <wp:anchor distT="0" distB="0" distL="114300" distR="114300" simplePos="0" relativeHeight="251664384" behindDoc="0" locked="0" layoutInCell="1" allowOverlap="1" wp14:anchorId="7E9641F1" wp14:editId="20C6008A">
+            <wp:simplePos x="0" y="0"/>
+            <wp:positionH relativeFrom="column">
+              <wp:posOffset>-92896</wp:posOffset>
+            </wp:positionH>
+            <wp:positionV relativeFrom="paragraph">
+              <wp:posOffset>-864235</wp:posOffset>
+            </wp:positionV>
+            <wp:extent cx="5972810" cy="920115"/>
+            <wp:effectExtent l="0" t="0" r="8890" b="0"/>
+            <wp:wrapNone/>
+            <wp:docPr id="7" name="Image 7"/>
+            <wp:cNvGraphicFramePr>
+              <a:graphicFrameLocks xmlns:a="http://schemas.openxmlformats.org/drawingml/2006/main" noChangeAspect="1"/>
+            </wp:cNvGraphicFramePr>
+            <a:graphic xmlns:a="http://schemas.openxmlformats.org/drawingml/2006/main">
+              <a:graphicData uri="http://schemas.openxmlformats.org/drawingml/2006/picture">
+                <pic:pic xmlns:pic="http://schemas.openxmlformats.org/drawingml/2006/picture">
+                  <pic:nvPicPr>
+                    <pic:cNvPr id="1" name=""/>
+                    <pic:cNvPicPr/>
+                  </pic:nvPicPr>
+                  <pic:blipFill>
+                    <a:blip r:embed="rId5">
+                      <a:extLst>
+                        <a:ext uri="{28A0092B-C50C-407E-A947-70E740481C1C}">
+                          <a14:useLocalDpi xmlns:a14="http://schemas.microsoft.com/office/drawing/2010/main" val="0"/>
+                        </a:ext>
+                      </a:extLst>
+                    </a:blip>
+                    <a:stretch>
+                      <a:fillRect/>
+                    </a:stretch>
+                  </pic:blipFill>
+                  <pic:spPr>
+                    <a:xfrm>
+                      <a:off x="0" y="0"/>
+                      <a:ext cx="5972810" cy="920115"/>
+                    </a:xfrm>
+                    <a:prstGeom prst="rect">
+                      <a:avLst/>
+                    </a:prstGeom>
+                  </pic:spPr>
+                </pic:pic>
+              </a:graphicData>
+            </a:graphic>
+          </wp:anchor>
+        </w:drawing>
+      </w:r>
+      <w:r>
         <w:rPr>
           <w:noProof/>
         </w:rPr>
         <w:drawing>
-          <wp:anchor distT="0" distB="0" distL="114300" distR="114300" simplePos="0" relativeHeight="251663360" behindDoc="0" locked="0" layoutInCell="1" allowOverlap="1" wp14:anchorId="78E769DF" wp14:editId="58CC5EAD">
+          <wp:anchor distT="0" distB="0" distL="114300" distR="114300" simplePos="0" relativeHeight="251663360" behindDoc="0" locked="0" layoutInCell="1" allowOverlap="1" wp14:anchorId="78E769DF" wp14:editId="3897D596">
             <wp:simplePos x="0" y="0"/>
             <wp:positionH relativeFrom="column">
-              <wp:posOffset>-83820</wp:posOffset>
+              <wp:posOffset>-91347</wp:posOffset>
             </wp:positionH>
             <wp:positionV relativeFrom="paragraph">
-              <wp:posOffset>-325341</wp:posOffset>
+              <wp:posOffset>32311</wp:posOffset>
             </wp:positionV>
-            <wp:extent cx="5972810" cy="821690"/>
-            <wp:effectExtent l="0" t="0" r="8890" b="0"/>
+            <wp:extent cx="5972810" cy="655843"/>
+            <wp:effectExtent l="0" t="0" r="0" b="0"/>
             <wp:wrapNone/>
             <wp:docPr id="6" name="Image 6"/>
             <wp:cNvGraphicFramePr>
@@ -31,7 +82,7 @@
                     <pic:cNvPicPr/>
                   </pic:nvPicPr>
                   <pic:blipFill>
-                    <a:blip r:embed="rId5" cstate="print">
+                    <a:blip r:embed="rId6" cstate="print">
                       <a:extLst>
                         <a:ext uri="{28A0092B-C50C-407E-A947-70E740481C1C}">
                           <a14:useLocalDpi xmlns:a14="http://schemas.microsoft.com/office/drawing/2010/main" val="0"/>
@@ -45,7 +96,7 @@
                   <pic:spPr>
                     <a:xfrm>
                       <a:off x="0" y="0"/>
-                      <a:ext cx="5972810" cy="821690"/>
+                      <a:ext cx="5972810" cy="655843"/>
                     </a:xfrm>
                     <a:prstGeom prst="rect">
                       <a:avLst/>
@@ -54,11 +105,16 @@
                 </pic:pic>
               </a:graphicData>
             </a:graphic>
+            <wp14:sizeRelV relativeFrom="margin">
+              <wp14:pctHeight>0</wp14:pctHeight>
+            </wp14:sizeRelV>
           </wp:anchor>
         </w:drawing>
       </w:r>
     </w:p>
     <w:p>
+      <w:bookmarkStart w:id="0" w:name="_GoBack"/>
+      <w:bookmarkEnd w:id="0"/>
       <w:r>
         <w:rPr>
           <w:noProof/>
@@ -87,7 +143,7 @@
                     <pic:cNvPicPr/>
                   </pic:nvPicPr>
                   <pic:blipFill>
-                    <a:blip r:embed="rId6" cstate="print">
+                    <a:blip r:embed="rId7" cstate="print">
                       <a:extLst>
                         <a:ext uri="{28A0092B-C50C-407E-A947-70E740481C1C}">
                           <a14:useLocalDpi xmlns:a14="http://schemas.microsoft.com/office/drawing/2010/main" val="0"/>
@@ -130,7 +186,6 @@
     <w:p/>
     <w:p/>
     <w:p>
-      <w:bookmarkStart w:id="0" w:name="_GoBack"/>
       <w:r>
         <w:rPr>
           <w:noProof/>
@@ -159,7 +214,7 @@
                     <pic:cNvPicPr/>
                   </pic:nvPicPr>
                   <pic:blipFill>
-                    <a:blip r:embed="rId7" cstate="print">
+                    <a:blip r:embed="rId8" cstate="print">
                       <a:extLst>
                         <a:ext uri="{28A0092B-C50C-407E-A947-70E740481C1C}">
                           <a14:useLocalDpi xmlns:a14="http://schemas.microsoft.com/office/drawing/2010/main" val="0"/>
@@ -191,7 +246,6 @@
           </wp:anchor>
         </w:drawing>
       </w:r>
-      <w:bookmarkEnd w:id="0"/>
     </w:p>
     <w:p/>
     <w:p/>
@@ -231,7 +285,7 @@
                     <pic:cNvPicPr/>
                   </pic:nvPicPr>
                   <pic:blipFill>
-                    <a:blip r:embed="rId8" cstate="print">
+                    <a:blip r:embed="rId9" cstate="print">
                       <a:extLst>
                         <a:ext uri="{28A0092B-C50C-407E-A947-70E740481C1C}">
                           <a14:useLocalDpi xmlns:a14="http://schemas.microsoft.com/office/drawing/2010/main" val="0"/>
@@ -298,7 +352,7 @@
                     <pic:cNvPicPr/>
                   </pic:nvPicPr>
                   <pic:blipFill>
-                    <a:blip r:embed="rId9" cstate="print">
+                    <a:blip r:embed="rId10" cstate="print">
                       <a:extLst>
                         <a:ext uri="{28A0092B-C50C-407E-A947-70E740481C1C}">
                           <a14:useLocalDpi xmlns:a14="http://schemas.microsoft.com/office/drawing/2010/main" val="0"/>
@@ -352,7 +406,7 @@
                     <pic:cNvPicPr/>
                   </pic:nvPicPr>
                   <pic:blipFill>
-                    <a:blip r:embed="rId10" cstate="print">
+                    <a:blip r:embed="rId11" cstate="print">
                       <a:extLst>
                         <a:ext uri="{28A0092B-C50C-407E-A947-70E740481C1C}">
                           <a14:useLocalDpi xmlns:a14="http://schemas.microsoft.com/office/drawing/2010/main" val="0"/>
@@ -408,7 +462,7 @@
       </w:pPr>
     </w:pPrDefault>
   </w:docDefaults>
-  <w:latentStyles w:defLockedState="0" w:defUIPriority="99" w:defSemiHidden="0" w:defUnhideWhenUsed="0" w:defQFormat="0" w:count="375">
+  <w:latentStyles w:defLockedState="0" w:defUIPriority="99" w:defSemiHidden="0" w:defUnhideWhenUsed="0" w:defQFormat="0" w:count="377">
     <w:lsdException w:name="Normal" w:uiPriority="0" w:qFormat="1"/>
     <w:lsdException w:name="heading 1" w:uiPriority="9" w:qFormat="1"/>
     <w:lsdException w:name="heading 2" w:semiHidden="1" w:uiPriority="9" w:unhideWhenUsed="1" w:qFormat="1"/>
@@ -514,7 +568,6 @@
     <w:lsdException w:name="HTML Sample" w:semiHidden="1" w:unhideWhenUsed="1"/>
     <w:lsdException w:name="HTML Typewriter" w:semiHidden="1" w:unhideWhenUsed="1"/>
     <w:lsdException w:name="HTML Variable" w:semiHidden="1" w:unhideWhenUsed="1"/>
-    <w:lsdException w:name="Normal Table" w:semiHidden="1" w:unhideWhenUsed="1"/>
     <w:lsdException w:name="annotation subject" w:semiHidden="1" w:unhideWhenUsed="1"/>
     <w:lsdException w:name="No List" w:semiHidden="1" w:unhideWhenUsed="1"/>
     <w:lsdException w:name="Outline List 1" w:semiHidden="1" w:unhideWhenUsed="1"/>
@@ -560,11 +613,9 @@
     <w:lsdException w:name="Table Subtle 1" w:semiHidden="1" w:unhideWhenUsed="1"/>
     <w:lsdException w:name="Table Subtle 2" w:semiHidden="1" w:unhideWhenUsed="1"/>
     <w:lsdException w:name="Table Web 1" w:semiHidden="1" w:unhideWhenUsed="1"/>
-    <w:lsdException w:name="Table Web 2" w:semiHidden="1" w:unhideWhenUsed="1"/>
     <w:lsdException w:name="Table Web 3" w:semiHidden="1" w:unhideWhenUsed="1"/>
     <w:lsdException w:name="Balloon Text" w:semiHidden="1" w:unhideWhenUsed="1"/>
     <w:lsdException w:name="Table Grid" w:uiPriority="39"/>
-    <w:lsdException w:name="Table Theme" w:semiHidden="1" w:unhideWhenUsed="1"/>
     <w:lsdException w:name="Placeholder Text" w:semiHidden="1"/>
     <w:lsdException w:name="No Spacing" w:uiPriority="1" w:qFormat="1"/>
     <w:lsdException w:name="Light Shading" w:uiPriority="60"/>
@@ -784,6 +835,8 @@
     <w:lsdException w:name="Smart Hyperlink" w:semiHidden="1" w:unhideWhenUsed="1"/>
     <w:lsdException w:name="Hashtag" w:semiHidden="1" w:unhideWhenUsed="1"/>
     <w:lsdException w:name="Unresolved Mention" w:semiHidden="1" w:unhideWhenUsed="1"/>
+    <w:lsdException w:name="Smart Link" w:semiHidden="1" w:unhideWhenUsed="1"/>
+    <w:lsdException w:name="Smart Link Error" w:semiHidden="1" w:unhideWhenUsed="1"/>
   </w:latentStyles>
   <w:style w:type="paragraph" w:default="1" w:styleId="Normal">
     <w:name w:val="Normal"/>
@@ -1628,7 +1681,7 @@
 </file>
 
 <file path=customXml/itemProps1.xml><?xml version="1.0" encoding="utf-8"?>
-<ds:datastoreItem xmlns:ds="http://schemas.openxmlformats.org/officeDocument/2006/customXml" ds:itemID="{1111F5E4-218B-42D5-BDC4-C0AB3C861A30}">
+<ds:datastoreItem xmlns:ds="http://schemas.openxmlformats.org/officeDocument/2006/customXml" ds:itemID="{A2718401-C90F-4400-A579-00BCCEB3EC1A}">
   <ds:schemaRefs>
     <ds:schemaRef ds:uri="http://schemas.openxmlformats.org/officeDocument/2006/bibliography"/>
   </ds:schemaRefs>

</xml_diff>